<commit_message>
ACS template compliance: page-number footers, Table 1 title
The ACS template carries two footer parts with PAGE fields; the draft had
neither, so pages were unnumbered. Both are added and referenced from the
section properties, matching the template's even/default arrangement.

Table 1 carried its title as a merged full-width first row, while Tables
2 and 3 use a VDTableTitle paragraph above the table. Table 1 now matches
them, which also removes one merged row.

Co-Authored-By: Claude Opus 5 <noreply@anthropic.com>
</commit_message>
<xml_diff>
--- a/paper/submission/DorDRM-MD-09-02-26-ACS.docx
+++ b/paper/submission/DorDRM-MD-09-02-26-ACS.docx
@@ -194,7 +194,11 @@
         <w:t>in silico</w:t>
       </w:r>
       <w:r>
-        <w:t xml:space="preserve"> framework for retrospectively predicting DOR resistance. We assembled a curated panel of 18 DOR-associated genotypes spanning susceptible, resistant, and uncertain phenotypes and performed all-atom, explicit-solvent molecular dynamics simulations of wild-type and mutant RT–DOR complexes. Mutation-induced changes in DOR binding were estimated using nonequilibrium alchemical free-energy perturbation (FEP; ΔΔG</w:t>
+        <w:t xml:space="preserve"> framework for retrospectively predicting DOR resistance. We assembled a curated panel of 18 DOR-associated genotypes spanning susceptible, resistant, and uncertain phenotypes and performed all-atom, explicit-solvent molecular dynamics simulations of wild-type and mutant RT–DOR complexes. Mutation-induced changes in DOR binding were estimated using nonequilibrium alchemical free-energy perturbation (FEP; </w:t>
+      </w:r>
+      <w:proofErr w:type="spellStart"/>
+      <w:r>
+        <w:t>ΔΔG</w:t>
       </w:r>
       <w:r>
         <w:rPr>
@@ -202,12 +206,17 @@
         </w:rPr>
         <w:t>bind</w:t>
       </w:r>
+      <w:proofErr w:type="spellEnd"/>
       <w:r>
         <w:t xml:space="preserve">) </w:t>
       </w:r>
       <w:r>
         <w:lastRenderedPageBreak/>
-        <w:t>and wild-type-referenced MM/GBSA interaction energies (ΔΔE</w:t>
+        <w:t>and wild-type-referenced MM/GBSA interaction energies (</w:t>
+      </w:r>
+      <w:proofErr w:type="spellStart"/>
+      <w:r>
+        <w:t>ΔΔE</w:t>
       </w:r>
       <w:r>
         <w:rPr>
@@ -215,6 +224,7 @@
         </w:rPr>
         <w:t>Total</w:t>
       </w:r>
+      <w:proofErr w:type="spellEnd"/>
       <w:r>
         <w:t>), and compared with experimentally measured fold-changes in DOR susceptibility. Furthermore, several key features on the DOR-RT interface were computed from the MD simulations data.</w:t>
       </w:r>
@@ -242,7 +252,11 @@
         <w:t xml:space="preserve"> </w:t>
       </w:r>
       <w:r>
-        <w:t>FEP correctly predicted little effect on DOR binding for 3 of 4 susceptible mutations and reduced binding for 7 of 9 resistant genotypes. Across these 13 genotypes with established susceptible or resistant phenotypes, a weak correlation between relative change in binding free energy, ΔΔG</w:t>
+        <w:t xml:space="preserve">FEP correctly predicted little effect on DOR binding for 3 of 4 susceptible mutations and reduced binding for 7 of 9 resistant genotypes. Across these 13 genotypes with established susceptible or resistant phenotypes, a weak correlation between relative change in binding free energy, </w:t>
+      </w:r>
+      <w:proofErr w:type="spellStart"/>
+      <w:r>
+        <w:t>ΔΔG</w:t>
       </w:r>
       <w:r>
         <w:rPr>
@@ -250,6 +264,7 @@
         </w:rPr>
         <w:t>bind</w:t>
       </w:r>
+      <w:proofErr w:type="spellEnd"/>
       <w:r>
         <w:t>, and with log</w:t>
       </w:r>
@@ -280,7 +295,11 @@
         <w:t>p</w:t>
       </w:r>
       <w:r>
-        <w:t xml:space="preserve"> = 0.26). In contrast, while MM/GBSA also correctly identified unfavorable energetic changes for 7 of 9 resistant genotypes, only 1 out of 4 susceptible mutations was identified as low-impact. Across the whole panel, ΔΔG</w:t>
+        <w:t xml:space="preserve"> = 0.26). In contrast, while MM/GBSA also correctly identified unfavorable energetic changes for 7 of 9 resistant genotypes, only 1 out of 4 susceptible mutations was identified as low-impact. Across the whole panel, </w:t>
+      </w:r>
+      <w:proofErr w:type="spellStart"/>
+      <w:r>
+        <w:t>ΔΔG</w:t>
       </w:r>
       <w:r>
         <w:rPr>
@@ -288,8 +307,13 @@
         </w:rPr>
         <w:t>bind</w:t>
       </w:r>
-      <w:r>
-        <w:t xml:space="preserve"> and ΔΔE</w:t>
+      <w:proofErr w:type="spellEnd"/>
+      <w:r>
+        <w:t xml:space="preserve"> and </w:t>
+      </w:r>
+      <w:proofErr w:type="spellStart"/>
+      <w:r>
+        <w:t>ΔΔE</w:t>
       </w:r>
       <w:r>
         <w:rPr>
@@ -297,6 +321,7 @@
         </w:rPr>
         <w:t>Total</w:t>
       </w:r>
+      <w:proofErr w:type="spellEnd"/>
       <w:r>
         <w:t xml:space="preserve"> were themselves modestly correlated (R² = 0.18, </w:t>
       </w:r>
@@ -636,7 +661,15 @@
         </w:rPr>
       </w:pPr>
       <w:r>
-        <w:t>Doravirine (DOR) was designed by introducing cyclic constraints in a novel class of diaryl ether NNRTIs.</w:t>
+        <w:t xml:space="preserve">Doravirine (DOR) was designed by introducing cyclic constraints in a novel class of </w:t>
+      </w:r>
+      <w:proofErr w:type="spellStart"/>
+      <w:r>
+        <w:t>diaryl</w:t>
+      </w:r>
+      <w:proofErr w:type="spellEnd"/>
+      <w:r>
+        <w:t xml:space="preserve"> ether NNRTIs.</w:t>
       </w:r>
       <w:r>
         <w:fldChar w:fldCharType="begin"/>
@@ -820,7 +853,15 @@
         <w:fldChar w:fldCharType="end"/>
       </w:r>
       <w:r>
-        <w:t xml:space="preserve"> In complexes with other NNRTIs, both tyrosines stack with the inhibitor, and Y181C and Y188L are thought to confer resistance by removing that stacking.</w:t>
+        <w:t xml:space="preserve"> In complexes with other NNRTIs, both </w:t>
+      </w:r>
+      <w:proofErr w:type="spellStart"/>
+      <w:r>
+        <w:t>tyrosines</w:t>
+      </w:r>
+      <w:proofErr w:type="spellEnd"/>
+      <w:r>
+        <w:t xml:space="preserve"> stack with the inhibitor, and Y181C and Y188L are thought to confer resistance by removing that stacking.</w:t>
       </w:r>
       <w:r>
         <w:fldChar w:fldCharType="begin"/>
@@ -1321,7 +1362,11 @@
       </w:pPr>
       <w:r>
         <w:lastRenderedPageBreak/>
-        <w:t>To address this question, we quantified the effect of each genotype on DOR binding using two complementary calculations. Alchemical free energy perturbation estimates ΔΔG</w:t>
+        <w:t xml:space="preserve">To address this question, we quantified the effect of each genotype on DOR binding using two complementary calculations. Alchemical free energy perturbation estimates </w:t>
+      </w:r>
+      <w:proofErr w:type="spellStart"/>
+      <w:r>
+        <w:t>ΔΔG</w:t>
       </w:r>
       <w:r>
         <w:rPr>
@@ -1329,6 +1374,7 @@
         </w:rPr>
         <w:t>bind</w:t>
       </w:r>
+      <w:proofErr w:type="spellEnd"/>
       <w:r>
         <w:t>, the change in the free energy of DOR binding caused by a mutation.</w:t>
       </w:r>
@@ -1581,6 +1627,7 @@
       <w:r>
         <w:t xml:space="preserve">The starting </w:t>
       </w:r>
+      <w:proofErr w:type="spellStart"/>
       <w:r>
         <w:rPr>
           <w:i/>
@@ -1588,6 +1635,7 @@
         </w:rPr>
         <w:t>holo</w:t>
       </w:r>
+      <w:proofErr w:type="spellEnd"/>
       <w:r>
         <w:t xml:space="preserve"> structure was the crystal structure of HIV-1 RT bound to doravirine (DOR; PDB ligand residue 2KW) from PDB 4NCG (</w:t>
       </w:r>
@@ -1646,7 +1694,15 @@
         </w:r>
       </w:hyperlink>
       <w:r>
-        <w:t>) and rigidly aligned to the crystallographic ligand heavy atoms by least-squares superposition using the Kabsch algorithm.</w:t>
+        <w:t xml:space="preserve">) and rigidly aligned to the crystallographic ligand heavy atoms by least-squares superposition using the </w:t>
+      </w:r>
+      <w:proofErr w:type="spellStart"/>
+      <w:r>
+        <w:t>Kabsch</w:t>
+      </w:r>
+      <w:proofErr w:type="spellEnd"/>
+      <w:r>
+        <w:t xml:space="preserve"> algorithm.</w:t>
       </w:r>
       <w:r>
         <w:fldChar w:fldCharType="begin"/>
@@ -1697,7 +1753,15 @@
         </w:rPr>
       </w:pPr>
       <w:r>
-        <w:t>Equilibrium MD simulations were performed with OpenMM 8.5.2.</w:t>
+        <w:t xml:space="preserve">Equilibrium MD simulations were performed with </w:t>
+      </w:r>
+      <w:proofErr w:type="spellStart"/>
+      <w:r>
+        <w:t>OpenMM</w:t>
+      </w:r>
+      <w:proofErr w:type="spellEnd"/>
+      <w:r>
+        <w:t xml:space="preserve"> 8.5.2.</w:t>
       </w:r>
       <w:r>
         <w:fldChar w:fldCharType="begin"/>
@@ -1718,7 +1782,15 @@
         <w:fldChar w:fldCharType="end"/>
       </w:r>
       <w:r>
-        <w:t xml:space="preserve"> Protein parameters were assigned from the Amber14 OpenMM force-field files, using ff14SB for protein,</w:t>
+        <w:t xml:space="preserve"> Protein parameters were assigned from the Amber14 </w:t>
+      </w:r>
+      <w:proofErr w:type="spellStart"/>
+      <w:r>
+        <w:t>OpenMM</w:t>
+      </w:r>
+      <w:proofErr w:type="spellEnd"/>
+      <w:r>
+        <w:t xml:space="preserve"> force-field files, using ff14SB for protein,</w:t>
       </w:r>
       <w:r>
         <w:fldChar w:fldCharType="begin"/>
@@ -1760,7 +1832,31 @@
         <w:fldChar w:fldCharType="end"/>
       </w:r>
       <w:r>
-        <w:t xml:space="preserve"> DOR parameters were generated through the OpenFF/SMIRNOFF template generator (openmmforcefields 0.16.0, OpenFF Toolkit 0.18.0) using direct chemical perception,</w:t>
+        <w:t xml:space="preserve"> DOR parameters were generated through the </w:t>
+      </w:r>
+      <w:proofErr w:type="spellStart"/>
+      <w:r>
+        <w:t>OpenFF</w:t>
+      </w:r>
+      <w:proofErr w:type="spellEnd"/>
+      <w:r>
+        <w:t>/SMIRNOFF template generator (</w:t>
+      </w:r>
+      <w:proofErr w:type="spellStart"/>
+      <w:r>
+        <w:t>openmmforcefields</w:t>
+      </w:r>
+      <w:proofErr w:type="spellEnd"/>
+      <w:r>
+        <w:t xml:space="preserve"> 0.16.0, </w:t>
+      </w:r>
+      <w:proofErr w:type="spellStart"/>
+      <w:r>
+        <w:t>OpenFF</w:t>
+      </w:r>
+      <w:proofErr w:type="spellEnd"/>
+      <w:r>
+        <w:t xml:space="preserve"> Toolkit 0.18.0) using direct chemical perception,</w:t>
       </w:r>
       <w:r>
         <w:fldChar w:fldCharType="begin"/>
@@ -1781,7 +1877,11 @@
         <w:fldChar w:fldCharType="end"/>
       </w:r>
       <w:r>
-        <w:t xml:space="preserve"> with Gasteiger partial charges.</w:t>
+        <w:t xml:space="preserve"> with </w:t>
+      </w:r>
+      <w:r>
+        <w:lastRenderedPageBreak/>
+        <w:t>Gasteiger partial charges.</w:t>
       </w:r>
       <w:r>
         <w:fldChar w:fldCharType="begin"/>
@@ -1802,11 +1902,7 @@
         <w:fldChar w:fldCharType="end"/>
       </w:r>
       <w:r>
-        <w:t xml:space="preserve"> Each complex was solvated </w:t>
-      </w:r>
-      <w:r>
-        <w:lastRenderedPageBreak/>
-        <w:t>in a TIP3P periodic box with 1.0 nm padding and neutralized at 0.15 M ionic strength. Nonbonded interactions used particle-mesh Ewald electrostatics</w:t>
+        <w:t xml:space="preserve"> Each complex was solvated in a TIP3P periodic box with 1.0 nm padding and neutralized at 0.15 M ionic strength. Nonbonded interactions used particle-mesh Ewald electrostatics</w:t>
       </w:r>
       <w:r>
         <w:fldChar w:fldCharType="begin"/>
@@ -1885,7 +1981,15 @@
         <w:t>−2</w:t>
       </w:r>
       <w:r>
-        <w:t>, and 5,000 unrestrained iterations). Systems were then heated from 10 K to 300 K over 25 ps under NVT conditions. Production simulations were run at 300 K and 1 bar using the Langevin middle integrator, a 2 fs timestep, 1 ps</w:t>
+        <w:t xml:space="preserve">, and 5,000 unrestrained iterations). Systems were then heated from 10 K to 300 K over 25 </w:t>
+      </w:r>
+      <w:proofErr w:type="spellStart"/>
+      <w:r>
+        <w:t>ps</w:t>
+      </w:r>
+      <w:proofErr w:type="spellEnd"/>
+      <w:r>
+        <w:t xml:space="preserve"> under NVT conditions. Production simulations were run at 300 K and 1 bar using the Langevin middle integrator, a 2 fs timestep, 1 ps</w:t>
       </w:r>
       <w:r>
         <w:rPr>
@@ -1894,7 +1998,15 @@
         <w:t>−1</w:t>
       </w:r>
       <w:r>
-        <w:t xml:space="preserve"> friction coefficient, and a Monte Carlo barostat with a 25-step coupling interval. State information was written every 2,000 integration steps. For downstream analysis, stripped protein-plus-ligand DCD trajectories were saved at approximately 200 evenly spaced frames per 100 ns production simulation.</w:t>
+        <w:t xml:space="preserve"> friction coefficient, and a Monte Carlo </w:t>
+      </w:r>
+      <w:proofErr w:type="spellStart"/>
+      <w:r>
+        <w:t>barostat</w:t>
+      </w:r>
+      <w:proofErr w:type="spellEnd"/>
+      <w:r>
+        <w:t xml:space="preserve"> with a 25-step coupling interval. State information was written every 2,000 integration steps. For downstream analysis, stripped protein-plus-ligand DCD trajectories were saved at approximately 200 evenly spaced frames per 100 ns production simulation.</w:t>
       </w:r>
     </w:p>
     <w:p>
@@ -1924,7 +2036,15 @@
         </w:rPr>
       </w:pPr>
       <w:r>
-        <w:t>Trajectory analyses were performed with MDAnalysis 2.10.0</w:t>
+        <w:t xml:space="preserve">Trajectory analyses were performed with </w:t>
+      </w:r>
+      <w:proofErr w:type="spellStart"/>
+      <w:r>
+        <w:t>MDAnalysis</w:t>
+      </w:r>
+      <w:proofErr w:type="spellEnd"/>
+      <w:r>
+        <w:t xml:space="preserve"> 2.10.0</w:t>
       </w:r>
       <w:r>
         <w:fldChar w:fldCharType="begin"/>
@@ -1945,7 +2065,15 @@
         <w:fldChar w:fldCharType="end"/>
       </w:r>
       <w:r>
-        <w:t xml:space="preserve"> and MDTraj 1.11.1.</w:t>
+        <w:t xml:space="preserve"> and </w:t>
+      </w:r>
+      <w:proofErr w:type="spellStart"/>
+      <w:r>
+        <w:t>MDTraj</w:t>
+      </w:r>
+      <w:proofErr w:type="spellEnd"/>
+      <w:r>
+        <w:t xml:space="preserve"> 1.11.1.</w:t>
       </w:r>
       <w:r>
         <w:fldChar w:fldCharType="begin"/>
@@ -1988,11 +2116,11 @@
         </w:rPr>
       </w:pPr>
       <w:r>
-        <w:t>DOR pose root mean squared deviation (RMSD) was computed after protein-pocket alignment from DOR heavy atoms relative to the crystallographic pose, and the DOR–RT center-of-mass distance as the separation between the center of mass of DOR and that of the protein. Residue–</w:t>
+        <w:t xml:space="preserve">DOR pose root mean squared deviation (RMSD) was computed after protein-pocket alignment from DOR heavy atoms relative to the crystallographic pose, and the DOR–RT center-of-mass </w:t>
       </w:r>
       <w:r>
         <w:lastRenderedPageBreak/>
-        <w:t>DOR proximity was computed as the minimum heavy-atom distance between DOR and each specified RT residue; named interactions between specific atoms, such as the hydrogen bond between the Lys103 main-chain carbonyl oxygen and the DOR triazolinone nitrogen, were measured as the distance between those two atoms directly.</w:t>
+        <w:t>distance as the separation between the center of mass of DOR and that of the protein. Residue–DOR proximity was computed as the minimum heavy-atom distance between DOR and each specified RT residue; named interactions between specific atoms, such as the hydrogen bond between the Lys103 main-chain carbonyl oxygen and the DOR triazolinone nitrogen, were measured as the distance between those two atoms directly.</w:t>
       </w:r>
     </w:p>
     <w:p>
@@ -2068,7 +2196,11 @@
         <w:fldChar w:fldCharType="end"/>
       </w:r>
       <w:r>
-        <w:t xml:space="preserve"> The analysis used the same molecular-mechanics parameters as the production simulations. We evaluated complex, receptor (RT), and ligand (DOR) energies separately,</w:t>
+        <w:t xml:space="preserve"> The analysis used the same </w:t>
+      </w:r>
+      <w:r>
+        <w:lastRenderedPageBreak/>
+        <w:t>molecular-mechanics parameters as the production simulations. We evaluated complex, receptor (RT), and ligand (DOR) energies separately,</w:t>
       </w:r>
     </w:p>
     <w:p>
@@ -2087,7 +2219,6 @@
             <w:rFonts w:ascii="Cambria Math" w:hAnsi="Cambria Math"/>
             <w:szCs w:val="24"/>
           </w:rPr>
-          <w:lastRenderedPageBreak/>
           <m:t>∆E=</m:t>
         </m:r>
         <m:sSub>
@@ -2379,7 +2510,11 @@
         </w:rPr>
       </w:pPr>
       <w:r>
-        <w:t>Here, ∆E</w:t>
+        <w:t>Here, ∆</w:t>
+      </w:r>
+      <w:proofErr w:type="spellStart"/>
+      <w:r>
+        <w:t>E</w:t>
       </w:r>
       <w:r>
         <w:rPr>
@@ -2387,8 +2522,13 @@
         </w:rPr>
         <w:t>vdW</w:t>
       </w:r>
-      <w:r>
-        <w:t xml:space="preserve"> and ∆E</w:t>
+      <w:proofErr w:type="spellEnd"/>
+      <w:r>
+        <w:t xml:space="preserve"> and ∆</w:t>
+      </w:r>
+      <w:proofErr w:type="spellStart"/>
+      <w:r>
+        <w:t>E</w:t>
       </w:r>
       <w:r>
         <w:rPr>
@@ -2396,6 +2536,7 @@
         </w:rPr>
         <w:t>elec</w:t>
       </w:r>
+      <w:proofErr w:type="spellEnd"/>
       <w:r>
         <w:t xml:space="preserve"> are the van der Waals and electrostatic molecular-mechanics contributions evaluated by selectively zeroing the complementary nonbonded parameters. ∆E</w:t>
       </w:r>
@@ -2406,7 +2547,15 @@
         <w:t>GB</w:t>
       </w:r>
       <w:r>
-        <w:t xml:space="preserve"> is the polar solvation computed with the Onufriev-Bashford-Case generalized Born model,</w:t>
+        <w:t xml:space="preserve"> is the polar solvation computed with the </w:t>
+      </w:r>
+      <w:proofErr w:type="spellStart"/>
+      <w:r>
+        <w:t>Onufriev</w:t>
+      </w:r>
+      <w:proofErr w:type="spellEnd"/>
+      <w:r>
+        <w:t>-Bashford-Case generalized Born model,</w:t>
       </w:r>
       <w:r>
         <w:fldChar w:fldCharType="begin"/>
@@ -2746,7 +2895,11 @@
         <w:pStyle w:val="TAMainText"/>
       </w:pPr>
       <w:r>
-        <w:t>However, direct calculation of ∆G</w:t>
+        <w:t>However, direct calculation of ∆</w:t>
+      </w:r>
+      <w:proofErr w:type="spellStart"/>
+      <w:r>
+        <w:t>G</w:t>
       </w:r>
       <w:r>
         <w:rPr>
@@ -2754,8 +2907,13 @@
         </w:rPr>
         <w:t>bind</w:t>
       </w:r>
-      <w:r>
-        <w:t xml:space="preserve"> is computationally expensive. Because G is a state function, the change in DOR binding free energy was computed from a thermodynamic cycle in which the p66 substitution was introduced alchemically in both the DOR-bound and the ligand-free enzyme, </w:t>
+      <w:proofErr w:type="spellEnd"/>
+      <w:r>
+        <w:t xml:space="preserve"> is computationally expensive. Because G is a state function, the change in DOR binding free energy was computed from a thermodynamic cycle in </w:t>
+      </w:r>
+      <w:r>
+        <w:lastRenderedPageBreak/>
+        <w:t xml:space="preserve">which the p66 substitution was introduced alchemically in both the DOR-bound and the ligand-free enzyme, </w:t>
       </w:r>
     </w:p>
     <w:p>
@@ -2771,7 +2929,6 @@
             <w:rPr>
               <w:rFonts w:ascii="Cambria Math" w:hAnsi="Cambria Math"/>
             </w:rPr>
-            <w:lastRenderedPageBreak/>
             <m:t>ΔΔ</m:t>
           </m:r>
           <m:sSub>
@@ -3649,7 +3806,15 @@
         <w:t xml:space="preserve"> </w:t>
       </w:r>
       <w:r>
-        <w:t>the Hamiltonian of the system at coupling parameter λ. Wild-type and mutant end states were connected by pmx hybrid residues (development branch),</w:t>
+        <w:t xml:space="preserve">the Hamiltonian of the system at coupling parameter λ. Wild-type and mutant end states were connected by </w:t>
+      </w:r>
+      <w:proofErr w:type="spellStart"/>
+      <w:r>
+        <w:t>pmx</w:t>
+      </w:r>
+      <w:proofErr w:type="spellEnd"/>
+      <w:r>
+        <w:t xml:space="preserve"> hybrid residues (development branch),</w:t>
       </w:r>
       <w:r>
         <w:fldChar w:fldCharType="begin"/>
@@ -3670,11 +3835,27 @@
         <w:fldChar w:fldCharType="end"/>
       </w:r>
       <w:r>
-        <w:t xml:space="preserve"> which share a common backbone and carry dummy atoms only where the two side chains differ, built with the amber14sbmut mutation force field to match the ff14SB parameters used for MD; DOR parameters were carried over from the OpenFF 2.0.0 assignment and exported </w:t>
+        <w:t xml:space="preserve"> which share a common backbone and carry dummy atoms only where the two side chains differ, built with the amber14sbmut mutation force field to match the </w:t>
       </w:r>
       <w:r>
         <w:lastRenderedPageBreak/>
-        <w:t>to GROMACS format through OpenFF Interchange 0.5.0. The hybrid Hamiltonian interpolates between the two physical end states,</w:t>
+        <w:t xml:space="preserve">ff14SB parameters used for MD; DOR parameters were carried over from the </w:t>
+      </w:r>
+      <w:proofErr w:type="spellStart"/>
+      <w:r>
+        <w:t>OpenFF</w:t>
+      </w:r>
+      <w:proofErr w:type="spellEnd"/>
+      <w:r>
+        <w:t xml:space="preserve"> 2.0.0 assignment and exported to GROMACS format through </w:t>
+      </w:r>
+      <w:proofErr w:type="spellStart"/>
+      <w:r>
+        <w:t>OpenFF</w:t>
+      </w:r>
+      <w:proofErr w:type="spellEnd"/>
+      <w:r>
+        <w:t xml:space="preserve"> Interchange 0.5.0. The hybrid Hamiltonian interpolates between the two physical end states,</w:t>
       </w:r>
     </w:p>
     <w:p>
@@ -3965,7 +4146,15 @@
         <w:fldChar w:fldCharType="end"/>
       </w:r>
       <w:r>
-        <w:t xml:space="preserve"> requires sampling only at the two physical end states. Each end state was minimized with the free-energy Hamiltonian active at that λ so that dummy atoms relax, warmed for 500 ps under a C-rescale barostat,</w:t>
+        <w:t xml:space="preserve"> requires sampling only at the two physical end states. Each end state was minimized with the free-energy Hamiltonian active at that λ so that dummy atoms relax, warmed for 500 </w:t>
+      </w:r>
+      <w:proofErr w:type="spellStart"/>
+      <w:r>
+        <w:t>ps</w:t>
+      </w:r>
+      <w:proofErr w:type="spellEnd"/>
+      <w:r>
+        <w:t xml:space="preserve"> under a C-rescale barostat,</w:t>
       </w:r>
       <w:r>
         <w:fldChar w:fldCharType="begin"/>
@@ -3986,7 +4175,23 @@
         <w:fldChar w:fldCharType="end"/>
       </w:r>
       <w:r>
-        <w:t xml:space="preserve"> and then sampled for 5 ns at 300 K and 1 bar with velocity-rescaling temperature coupling and a Parrinello-Rahman barostat. From each end-state trajectory, 100 evenly spaced frames were extracted after discarding the first 100 ps; each seeded an independent simulation in which λ was driven linearly to the opposite end state, giving 100 forward and 100 reverse work values per phase per replicate. The work accumulated along each switch is</w:t>
+        <w:t xml:space="preserve"> and then sampled for 5 ns at 300 K and 1 bar with velocity-rescaling temperature coupling and a Parrinello-Rahman </w:t>
+      </w:r>
+      <w:proofErr w:type="spellStart"/>
+      <w:r>
+        <w:t>barostat</w:t>
+      </w:r>
+      <w:proofErr w:type="spellEnd"/>
+      <w:r>
+        <w:t xml:space="preserve">. From each end-state trajectory, 100 evenly spaced frames were extracted after discarding the first 100 </w:t>
+      </w:r>
+      <w:proofErr w:type="spellStart"/>
+      <w:r>
+        <w:t>ps</w:t>
+      </w:r>
+      <w:proofErr w:type="spellEnd"/>
+      <w:r>
+        <w:t>; each seeded an independent simulation in which λ was driven linearly to the opposite end state, giving 100 forward and 100 reverse work values per phase per replicate. The work accumulated along each switch is</w:t>
       </w:r>
     </w:p>
     <w:p>
@@ -4135,7 +4340,23 @@
         <w:pStyle w:val="TAMainText"/>
       </w:pPr>
       <w:r>
-        <w:t>Switching times were 100 ps, or 500 ps for legs with widely separated forward and reverse work distributions (e.g. charge-changing WT→K103N leg inherited by the K103N-containing genotypes); control runs on neutral legs gave ∆G values invariant to switching time.</w:t>
+        <w:t xml:space="preserve">Switching times were 100 </w:t>
+      </w:r>
+      <w:proofErr w:type="spellStart"/>
+      <w:r>
+        <w:t>ps</w:t>
+      </w:r>
+      <w:proofErr w:type="spellEnd"/>
+      <w:r>
+        <w:t xml:space="preserve">, or 500 </w:t>
+      </w:r>
+      <w:proofErr w:type="spellStart"/>
+      <w:r>
+        <w:t>ps</w:t>
+      </w:r>
+      <w:proofErr w:type="spellEnd"/>
+      <w:r>
+        <w:t xml:space="preserve"> for legs with widely separated forward and reverse work distributions (e.g. charge-changing WT→K103N leg inherited by the K103N-containing genotypes); control runs on neutral legs gave ∆G values invariant to switching time.</w:t>
       </w:r>
     </w:p>
     <w:p>
@@ -4143,6 +4364,7 @@
         <w:pStyle w:val="TAMainText"/>
       </w:pPr>
       <w:r>
+        <w:lastRenderedPageBreak/>
         <w:t>Because the switches are of finite duration, W exceeds ∆G on average, and the free energy must be recovered from the distribution of work values. Jarzynski’s equality</w:t>
       </w:r>
       <w:r>
@@ -4669,23 +4891,39 @@
         <w:fldChar w:fldCharType="end"/>
       </w:r>
       <w:r>
-        <w:t xml:space="preserve"> For equal number of forward and reverse switches (n</w:t>
+        <w:t xml:space="preserve"> For equal number of forward and reverse switches (</w:t>
+      </w:r>
+      <w:proofErr w:type="spellStart"/>
+      <w:r>
+        <w:t>n</w:t>
       </w:r>
       <w:r>
         <w:rPr>
           <w:vertAlign w:val="subscript"/>
         </w:rPr>
-        <w:t xml:space="preserve">F </w:t>
-      </w:r>
-      <w:r>
-        <w:t>= n</w:t>
-      </w:r>
+        <w:t>F</w:t>
+      </w:r>
+      <w:proofErr w:type="spellEnd"/>
       <w:r>
         <w:rPr>
           <w:vertAlign w:val="subscript"/>
         </w:rPr>
+        <w:t xml:space="preserve"> </w:t>
+      </w:r>
+      <w:r>
+        <w:t xml:space="preserve">= </w:t>
+      </w:r>
+      <w:proofErr w:type="spellStart"/>
+      <w:r>
+        <w:t>n</w:t>
+      </w:r>
+      <w:r>
+        <w:rPr>
+          <w:vertAlign w:val="subscript"/>
+        </w:rPr>
         <w:t>R</w:t>
       </w:r>
+      <w:proofErr w:type="spellEnd"/>
       <w:r>
         <w:t xml:space="preserve"> =100 here), ∆G is the value satisfying the self-consistent equation</w:t>
       </w:r>
@@ -5127,7 +5365,15 @@
         <w:pStyle w:val="TAMainText"/>
       </w:pPr>
       <w:r>
-        <w:t xml:space="preserve">Free energies were estimated from the above equation as implemented in pmx (100 bootstrap resamples, </w:t>
+        <w:t xml:space="preserve">Free energies were estimated from the above equation as implemented in </w:t>
+      </w:r>
+      <w:proofErr w:type="spellStart"/>
+      <w:r>
+        <w:t>pmx</w:t>
+      </w:r>
+      <w:proofErr w:type="spellEnd"/>
+      <w:r>
+        <w:t xml:space="preserve"> (100 bootstrap resamples, </w:t>
       </w:r>
       <w:r>
         <w:rPr>
@@ -5160,6 +5406,7 @@
       <w:r>
         <w:t xml:space="preserve"> because </w:t>
       </w:r>
+      <w:proofErr w:type="spellStart"/>
       <w:r>
         <w:rPr>
           <w:i/>
@@ -5167,6 +5414,7 @@
         </w:rPr>
         <w:t>holo</w:t>
       </w:r>
+      <w:proofErr w:type="spellEnd"/>
       <w:r>
         <w:t xml:space="preserve"> and </w:t>
       </w:r>
@@ -5204,11 +5452,19 @@
         <w:spacing w:after="240"/>
       </w:pPr>
       <w:r>
-        <w:t xml:space="preserve">Associations between the computed energies and phenotype were assessed by ordinary least-squares regression against log₁₀-transformed fold-change in susceptibility, reported as the coefficient of determination R² with the two-sided p-value for a non-zero slope </w:t>
+        <w:t xml:space="preserve">Associations between the computed energies and phenotype were assessed by ordinary least-squares regression against log₁₀-transformed fold-change in susceptibility, reported as the </w:t>
       </w:r>
       <w:r>
         <w:lastRenderedPageBreak/>
-        <w:t>(scipy.stats.linregress). Given the small size of the panel, these statistics are reported as descriptive effect sizes rather than as hypothesis tests, and no correction for multiple comparisons was applied.</w:t>
+        <w:t>coefficient of determination R² with the two-sided p-value for a non-zero slope (</w:t>
+      </w:r>
+      <w:proofErr w:type="spellStart"/>
+      <w:r>
+        <w:t>scipy.stats.linregress</w:t>
+      </w:r>
+      <w:proofErr w:type="spellEnd"/>
+      <w:r>
+        <w:t>). Given the small size of the panel, these statistics are reported as descriptive effect sizes rather than as hypothesis tests, and no correction for multiple comparisons was applied.</w:t>
       </w:r>
     </w:p>
     <w:p>
@@ -5358,7 +5614,11 @@
         </w:rPr>
       </w:pPr>
       <w:r>
-        <w:t>Table 1 summarizes the median fold-change in DOR susceptibility used to define the panel and Supplementary Table 1 traces the isolate-level data indexed in the Stanford HIVDB (</w:t>
+        <w:t xml:space="preserve">Table 1 summarizes the median fold-change in DOR susceptibility used to define the panel and Supplementary Table 1 traces the isolate-level data indexed in the Stanford HIVDB </w:t>
+      </w:r>
+      <w:r>
+        <w:lastRenderedPageBreak/>
+        <w:t>(</w:t>
       </w:r>
       <w:hyperlink r:id="rId12" w:history="1">
         <w:r>
@@ -5371,11 +5631,35 @@
         </w:r>
       </w:hyperlink>
       <w:r>
-        <w:t xml:space="preserve">). These susceptibility data were derived from assays performed using </w:t>
-      </w:r>
-      <w:r>
-        <w:lastRenderedPageBreak/>
-        <w:t xml:space="preserve">the Monogram PhenoSense assay and the relatively similar Merck reporter-gene assay. Isolates undergoing testing were either site-directed mutants or clinical isolates for which known NNRTI-resistance mutations were specified. </w:t>
+        <w:t xml:space="preserve">). These susceptibility data were derived from assays performed using the Monogram </w:t>
+      </w:r>
+      <w:proofErr w:type="spellStart"/>
+      <w:r>
+        <w:t>PhenoSense</w:t>
+      </w:r>
+      <w:proofErr w:type="spellEnd"/>
+      <w:r>
+        <w:t xml:space="preserve"> assay and the relatively similar Merck reporter-gene assay. Isolates undergoing testing were either site-directed mutants or clinical isolates for which known NNRTI-resistance mutations were specified. </w:t>
+      </w:r>
+    </w:p>
+    <w:p>
+      <w:pPr>
+        <w:pStyle w:val="VDTableTitle"/>
+        <w:rPr>
+          <w:rFonts w:ascii="Times New Roman" w:hAnsi="Times New Roman"/>
+          <w:sz w:val="22"/>
+          <w:szCs w:val="22"/>
+        </w:rPr>
+      </w:pPr>
+      <w:r>
+        <w:rPr>
+          <w:b/>
+          <w:bCs/>
+          <w:color w:val="000000"/>
+          <w:sz w:val="22"/>
+          <w:szCs w:val="22"/>
+        </w:rPr>
+        <w:t>Table 1. Fold-change in DOR susceptibility associated with selected genotypes</w:t>
       </w:r>
     </w:p>
     <w:tbl>
@@ -5402,43 +5686,6 @@
       </w:tblGrid>
       <w:tr>
         <w:trPr>
-          <w:trHeight w:val="260"/>
-        </w:trPr>
-        <w:tc>
-          <w:tcPr>
-            <w:tcW w:w="9558" w:type="dxa"/>
-            <w:gridSpan w:val="6"/>
-            <w:tcBorders>
-              <w:bottom w:val="single" w:sz="4" w:space="0" w:color="auto"/>
-            </w:tcBorders>
-          </w:tcPr>
-          <w:p>
-            <w:pPr>
-              <w:pStyle w:val="TCTableBody"/>
-              <w:rPr>
-                <w:rFonts w:ascii="Times New Roman" w:hAnsi="Times New Roman"/>
-                <w:b/>
-                <w:bCs/>
-                <w:color w:val="000000"/>
-                <w:sz w:val="22"/>
-                <w:szCs w:val="22"/>
-              </w:rPr>
-            </w:pPr>
-            <w:r>
-              <w:rPr>
-                <w:b/>
-                <w:bCs/>
-                <w:color w:val="000000"/>
-                <w:sz w:val="22"/>
-                <w:szCs w:val="22"/>
-              </w:rPr>
-              <w:t>Table 1. Fold-change in DOR susceptibility associated with selected genotypes</w:t>
-            </w:r>
-          </w:p>
-        </w:tc>
-      </w:tr>
-      <w:tr>
-        <w:trPr>
           <w:trHeight w:val="539"/>
         </w:trPr>
         <w:tc>
@@ -9095,6 +9342,7 @@
                 <w:sz w:val="22"/>
                 <w:szCs w:val="22"/>
               </w:rPr>
+              <w:lastRenderedPageBreak/>
               <w:t xml:space="preserve">Uncertain </w:t>
             </w:r>
           </w:p>
@@ -10305,25 +10553,38 @@
       <w:r>
         <w:t xml:space="preserve">We sampled RT-DOR structures from these </w:t>
       </w:r>
+      <w:proofErr w:type="spellStart"/>
       <w:r>
         <w:rPr>
           <w:i/>
           <w:iCs/>
         </w:rPr>
-        <w:t xml:space="preserve">holo </w:t>
-      </w:r>
-      <w:r>
-        <w:t xml:space="preserve">(RT+DOR) and corresponding </w:t>
-      </w:r>
+        <w:t>holo</w:t>
+      </w:r>
+      <w:proofErr w:type="spellEnd"/>
       <w:r>
         <w:rPr>
           <w:i/>
           <w:iCs/>
         </w:rPr>
+        <w:t xml:space="preserve"> </w:t>
+      </w:r>
+      <w:r>
+        <w:t xml:space="preserve">(RT+DOR) and corresponding </w:t>
+      </w:r>
+      <w:r>
+        <w:rPr>
+          <w:i/>
+          <w:iCs/>
+        </w:rPr>
         <w:t xml:space="preserve">apo </w:t>
       </w:r>
       <w:r>
-        <w:t>(RT only) simulations to compute the relative binding free energy, ∆∆G</w:t>
+        <w:t>(RT only) simulations to compute the relative binding free energy, ∆∆</w:t>
+      </w:r>
+      <w:proofErr w:type="spellStart"/>
+      <w:r>
+        <w:t>G</w:t>
       </w:r>
       <w:r>
         <w:rPr>
@@ -10331,8 +10592,17 @@
         </w:rPr>
         <w:t>bind</w:t>
       </w:r>
-      <w:r>
-        <w:t>, between the mutant and WT RT-DOR complexes using a non-equilibrium alchemical free energy calculation protocol (Figure 2). Additionally, we calculated the average MM/GBSA energy over 100 equally spaced snapshots of each equilibrium trajectory. For each mutant genotype, we then computed WT-referenced energetic changes for the total MM/GBSA energy (∆∆E</w:t>
+      <w:proofErr w:type="spellEnd"/>
+      <w:r>
+        <w:t xml:space="preserve">, between the mutant and WT RT-DOR complexes using a non-equilibrium alchemical free energy calculation protocol (Figure 2). Additionally, we calculated the average MM/GBSA energy over 100 equally spaced snapshots of each equilibrium trajectory. For each mutant genotype, we then computed WT-referenced </w:t>
+      </w:r>
+      <w:r>
+        <w:lastRenderedPageBreak/>
+        <w:t>energetic changes for the total MM/GBSA energy (∆∆</w:t>
+      </w:r>
+      <w:proofErr w:type="spellStart"/>
+      <w:r>
+        <w:t>E</w:t>
       </w:r>
       <w:r>
         <w:rPr>
@@ -10340,12 +10610,13 @@
         </w:rPr>
         <w:t>Total</w:t>
       </w:r>
-      <w:r>
-        <w:t xml:space="preserve">) and for four individual energy </w:t>
-      </w:r>
-      <w:r>
-        <w:lastRenderedPageBreak/>
-        <w:t>components: van der Waals (∆∆E</w:t>
+      <w:proofErr w:type="spellEnd"/>
+      <w:r>
+        <w:t>) and for four individual energy components: van der Waals (∆∆</w:t>
+      </w:r>
+      <w:proofErr w:type="spellStart"/>
+      <w:r>
+        <w:t>E</w:t>
       </w:r>
       <w:r>
         <w:rPr>
@@ -10353,8 +10624,13 @@
         </w:rPr>
         <w:t>vdW</w:t>
       </w:r>
-      <w:r>
-        <w:t>), electrostatic (∆∆E</w:t>
+      <w:proofErr w:type="spellEnd"/>
+      <w:r>
+        <w:t>), electrostatic (∆∆</w:t>
+      </w:r>
+      <w:proofErr w:type="spellStart"/>
+      <w:r>
+        <w:t>E</w:t>
       </w:r>
       <w:r>
         <w:rPr>
@@ -10362,6 +10638,7 @@
         </w:rPr>
         <w:t>elec</w:t>
       </w:r>
+      <w:proofErr w:type="spellEnd"/>
       <w:r>
         <w:t>), generalized Born polar solvation (∆∆E</w:t>
       </w:r>
@@ -10381,7 +10658,11 @@
         <w:t>SA</w:t>
       </w:r>
       <w:r>
-        <w:t>) contributions. The results are summarized in Table 2 (see Supplementary Table 3 for replicate-level results). Throughout this work, we classify a genotype as having a strong impact on ∆∆G</w:t>
+        <w:t>) contributions. The results are summarized in Table 2 (see Supplementary Table 3 for replicate-level results). Throughout this work, we classify a genotype as having a strong impact on ∆∆</w:t>
+      </w:r>
+      <w:proofErr w:type="spellStart"/>
+      <w:r>
+        <w:t>G</w:t>
       </w:r>
       <w:r>
         <w:rPr>
@@ -10389,8 +10670,13 @@
         </w:rPr>
         <w:t>bind</w:t>
       </w:r>
-      <w:r>
-        <w:t xml:space="preserve"> or ∆∆E</w:t>
+      <w:proofErr w:type="spellEnd"/>
+      <w:r>
+        <w:t xml:space="preserve"> or ∆∆</w:t>
+      </w:r>
+      <w:proofErr w:type="spellStart"/>
+      <w:r>
+        <w:t>E</w:t>
       </w:r>
       <w:r>
         <w:rPr>
@@ -10398,9 +10684,11 @@
         </w:rPr>
         <w:t>Total</w:t>
       </w:r>
+      <w:proofErr w:type="spellEnd"/>
       <w:r>
         <w:t xml:space="preserve"> when its estimate lies more than one standard error above (approximately) the thermal energy at room temperature, </w:t>
       </w:r>
+      <w:proofErr w:type="spellStart"/>
       <w:r>
         <w:rPr>
           <w:i/>
@@ -10423,6 +10711,7 @@
         </w:rPr>
         <w:t>T</w:t>
       </w:r>
+      <w:proofErr w:type="spellEnd"/>
       <w:r>
         <w:t xml:space="preserve"> = 0.5 kcal/mol, and as having a weak impact otherwise; genotypes with free energy below this threshold or whose replicate error spans this threshold are therefore counted as weak.</w:t>
       </w:r>
@@ -10493,7 +10782,17 @@
           <w:sz w:val="22"/>
           <w:szCs w:val="18"/>
         </w:rPr>
-        <w:t>Figure 2: Free Energy Perturbation (FEP) protocol used to estimate ∆∆G</w:t>
+        <w:t>Figure 2: Free Energy Perturbation (FEP) protocol used to estimate ∆∆</w:t>
+      </w:r>
+      <w:proofErr w:type="spellStart"/>
+      <w:r>
+        <w:rPr>
+          <w:b/>
+          <w:bCs/>
+          <w:sz w:val="22"/>
+          <w:szCs w:val="18"/>
+        </w:rPr>
+        <w:t>G</w:t>
       </w:r>
       <w:r>
         <w:rPr>
@@ -10505,6 +10804,7 @@
         </w:rPr>
         <w:t>bind</w:t>
       </w:r>
+      <w:proofErr w:type="spellEnd"/>
       <w:r>
         <w:rPr>
           <w:b/>
@@ -10551,6 +10851,7 @@
         </w:rPr>
         <w:t xml:space="preserve">Mut configurations in </w:t>
       </w:r>
+      <w:proofErr w:type="spellStart"/>
       <w:r>
         <w:rPr>
           <w:i/>
@@ -10558,15 +10859,9 @@
           <w:sz w:val="22"/>
           <w:szCs w:val="18"/>
         </w:rPr>
-        <w:t xml:space="preserve">holo </w:t>
-      </w:r>
-      <w:r>
-        <w:rPr>
-          <w:sz w:val="22"/>
-          <w:szCs w:val="18"/>
-        </w:rPr>
-        <w:t xml:space="preserve">and </w:t>
-      </w:r>
+        <w:t>holo</w:t>
+      </w:r>
+      <w:proofErr w:type="spellEnd"/>
       <w:r>
         <w:rPr>
           <w:i/>
@@ -10574,6 +10869,22 @@
           <w:sz w:val="22"/>
           <w:szCs w:val="18"/>
         </w:rPr>
+        <w:t xml:space="preserve"> </w:t>
+      </w:r>
+      <w:r>
+        <w:rPr>
+          <w:sz w:val="22"/>
+          <w:szCs w:val="18"/>
+        </w:rPr>
+        <w:t xml:space="preserve">and </w:t>
+      </w:r>
+      <w:r>
+        <w:rPr>
+          <w:i/>
+          <w:iCs/>
+          <w:sz w:val="22"/>
+          <w:szCs w:val="18"/>
+        </w:rPr>
         <w:t xml:space="preserve">apo </w:t>
       </w:r>
       <w:r>
@@ -10625,29 +10936,29 @@
           <w:sz w:val="22"/>
           <w:szCs w:val="18"/>
         </w:rPr>
-        <w:t xml:space="preserve"> = 1). As an illustration, in case of V106A, the RT p66 residue 106 contains atoms for both Valine and Alanine: When </w:t>
+        <w:t xml:space="preserve"> = 1). As an illustration, in case of V106A, the RT p66 residue 106 contains </w:t>
       </w:r>
       <w:r>
         <w:rPr>
           <w:sz w:val="22"/>
           <w:szCs w:val="18"/>
         </w:rPr>
-        <w:sym w:font="Symbol" w:char="F06C"/>
+        <w:lastRenderedPageBreak/>
+        <w:t xml:space="preserve">atoms for both Valine and Alanine: When </w:t>
       </w:r>
       <w:r>
         <w:rPr>
           <w:sz w:val="22"/>
           <w:szCs w:val="18"/>
         </w:rPr>
-        <w:t xml:space="preserve"> = 0, Valine sidechain atoms (green) are on and Alanine atoms </w:t>
+        <w:sym w:font="Symbol" w:char="F06C"/>
       </w:r>
       <w:r>
         <w:rPr>
           <w:sz w:val="22"/>
           <w:szCs w:val="18"/>
         </w:rPr>
-        <w:lastRenderedPageBreak/>
-        <w:t xml:space="preserve">(red) are off. When </w:t>
+        <w:t xml:space="preserve"> = 0, Valine sidechain atoms (green) are on and Alanine atoms (red) are off. When </w:t>
       </w:r>
       <w:r>
         <w:rPr>
@@ -10732,6 +11043,7 @@
         </w:rPr>
         <w:t xml:space="preserve">= 100 switches in both directions is plotted to get the ∆G value in both </w:t>
       </w:r>
+      <w:proofErr w:type="spellStart"/>
       <w:r>
         <w:rPr>
           <w:i/>
@@ -10739,15 +11051,9 @@
           <w:sz w:val="22"/>
           <w:szCs w:val="18"/>
         </w:rPr>
-        <w:t xml:space="preserve">holo </w:t>
-      </w:r>
-      <w:r>
-        <w:rPr>
-          <w:sz w:val="22"/>
-          <w:szCs w:val="18"/>
-        </w:rPr>
-        <w:t xml:space="preserve">and </w:t>
-      </w:r>
+        <w:t>holo</w:t>
+      </w:r>
+      <w:proofErr w:type="spellEnd"/>
       <w:r>
         <w:rPr>
           <w:i/>
@@ -10755,6 +11061,22 @@
           <w:sz w:val="22"/>
           <w:szCs w:val="18"/>
         </w:rPr>
+        <w:t xml:space="preserve"> </w:t>
+      </w:r>
+      <w:r>
+        <w:rPr>
+          <w:sz w:val="22"/>
+          <w:szCs w:val="18"/>
+        </w:rPr>
+        <w:t xml:space="preserve">and </w:t>
+      </w:r>
+      <w:r>
+        <w:rPr>
+          <w:i/>
+          <w:iCs/>
+          <w:sz w:val="22"/>
+          <w:szCs w:val="18"/>
+        </w:rPr>
         <w:t xml:space="preserve">apo </w:t>
       </w:r>
       <w:r>
@@ -10778,7 +11100,15 @@
           <w:sz w:val="22"/>
           <w:szCs w:val="18"/>
         </w:rPr>
-        <w:t xml:space="preserve"> Shift in binding free energy, ∆∆G</w:t>
+        <w:t xml:space="preserve"> Shift in binding free energy, ∆∆</w:t>
+      </w:r>
+      <w:proofErr w:type="spellStart"/>
+      <w:r>
+        <w:rPr>
+          <w:sz w:val="22"/>
+          <w:szCs w:val="18"/>
+        </w:rPr>
+        <w:t>G</w:t>
       </w:r>
       <w:r>
         <w:rPr>
@@ -10788,6 +11118,7 @@
         </w:rPr>
         <w:t>bind</w:t>
       </w:r>
+      <w:proofErr w:type="spellEnd"/>
       <w:r>
         <w:rPr>
           <w:sz w:val="22"/>
@@ -10986,8 +11317,9 @@
                 <w:sz w:val="22"/>
                 <w:szCs w:val="22"/>
               </w:rPr>
-              <w:t>∆∆E</w:t>
-            </w:r>
+              <w:t>∆∆</w:t>
+            </w:r>
+            <w:proofErr w:type="spellStart"/>
             <w:r>
               <w:rPr>
                 <w:b/>
@@ -10995,10 +11327,21 @@
                 <w:color w:val="000000"/>
                 <w:sz w:val="22"/>
                 <w:szCs w:val="22"/>
+              </w:rPr>
+              <w:t>E</w:t>
+            </w:r>
+            <w:r>
+              <w:rPr>
+                <w:b/>
+                <w:bCs/>
+                <w:color w:val="000000"/>
+                <w:sz w:val="22"/>
+                <w:szCs w:val="22"/>
                 <w:vertAlign w:val="subscript"/>
               </w:rPr>
               <w:t>Total</w:t>
             </w:r>
+            <w:proofErr w:type="spellEnd"/>
             <w:r>
               <w:rPr>
                 <w:b/>
@@ -11052,8 +11395,9 @@
                 <w:sz w:val="22"/>
                 <w:szCs w:val="22"/>
               </w:rPr>
-              <w:t>∆∆E</w:t>
-            </w:r>
+              <w:t>∆∆</w:t>
+            </w:r>
+            <w:proofErr w:type="spellStart"/>
             <w:r>
               <w:rPr>
                 <w:b/>
@@ -11061,10 +11405,21 @@
                 <w:color w:val="000000"/>
                 <w:sz w:val="22"/>
                 <w:szCs w:val="22"/>
+              </w:rPr>
+              <w:t>E</w:t>
+            </w:r>
+            <w:r>
+              <w:rPr>
+                <w:b/>
+                <w:bCs/>
+                <w:color w:val="000000"/>
+                <w:sz w:val="22"/>
+                <w:szCs w:val="22"/>
                 <w:vertAlign w:val="subscript"/>
               </w:rPr>
               <w:t>vdW</w:t>
             </w:r>
+            <w:proofErr w:type="spellEnd"/>
             <w:r>
               <w:rPr>
                 <w:b/>
@@ -11118,8 +11473,9 @@
                 <w:sz w:val="22"/>
                 <w:szCs w:val="22"/>
               </w:rPr>
-              <w:t>∆∆E</w:t>
-            </w:r>
+              <w:t>∆∆</w:t>
+            </w:r>
+            <w:proofErr w:type="spellStart"/>
             <w:r>
               <w:rPr>
                 <w:b/>
@@ -11127,10 +11483,21 @@
                 <w:color w:val="000000"/>
                 <w:sz w:val="22"/>
                 <w:szCs w:val="22"/>
+              </w:rPr>
+              <w:t>E</w:t>
+            </w:r>
+            <w:r>
+              <w:rPr>
+                <w:b/>
+                <w:bCs/>
+                <w:color w:val="000000"/>
+                <w:sz w:val="22"/>
+                <w:szCs w:val="22"/>
                 <w:vertAlign w:val="subscript"/>
               </w:rPr>
               <w:t>elec</w:t>
             </w:r>
+            <w:proofErr w:type="spellEnd"/>
             <w:r>
               <w:rPr>
                 <w:b/>
@@ -11313,8 +11680,9 @@
                 <w:sz w:val="22"/>
                 <w:szCs w:val="22"/>
               </w:rPr>
-              <w:t>∆∆G</w:t>
-            </w:r>
+              <w:t>∆∆</w:t>
+            </w:r>
+            <w:proofErr w:type="spellStart"/>
             <w:r>
               <w:rPr>
                 <w:b/>
@@ -11322,10 +11690,21 @@
                 <w:color w:val="000000"/>
                 <w:sz w:val="22"/>
                 <w:szCs w:val="22"/>
+              </w:rPr>
+              <w:t>G</w:t>
+            </w:r>
+            <w:r>
+              <w:rPr>
+                <w:b/>
+                <w:bCs/>
+                <w:color w:val="000000"/>
+                <w:sz w:val="22"/>
+                <w:szCs w:val="22"/>
                 <w:vertAlign w:val="subscript"/>
               </w:rPr>
               <w:t>bind</w:t>
             </w:r>
+            <w:proofErr w:type="spellEnd"/>
             <w:r>
               <w:rPr>
                 <w:b/>
@@ -12245,7 +12624,6 @@
                 <w:sz w:val="22"/>
                 <w:szCs w:val="22"/>
               </w:rPr>
-              <w:lastRenderedPageBreak/>
               <w:t>Resistant</w:t>
             </w:r>
           </w:p>
@@ -15105,7 +15483,15 @@
           <w:sz w:val="22"/>
           <w:szCs w:val="22"/>
         </w:rPr>
-        <w:t>Abbreviations: WT, wild-type; MD, molecular dynamics; MM/GBSA, molecular mechanics with generalized Born and surface area solvation; FEP, free energy perturbation; BAR, Bennett acceptance ratio; SEM, standard error of the mean. ∆∆E</w:t>
+        <w:t>Abbreviations: WT, wild-type; MD, molecular dynamics; MM/GBSA, molecular mechanics with generalized Born and surface area solvation; FEP, free energy perturbation; BAR, Bennett acceptance ratio; SEM, standard error of the mean. ∆∆</w:t>
+      </w:r>
+      <w:proofErr w:type="spellStart"/>
+      <w:r>
+        <w:rPr>
+          <w:sz w:val="22"/>
+          <w:szCs w:val="22"/>
+        </w:rPr>
+        <w:t>E</w:t>
       </w:r>
       <w:r>
         <w:rPr>
@@ -15115,12 +15501,21 @@
         </w:rPr>
         <w:t>Total</w:t>
       </w:r>
+      <w:proofErr w:type="spellEnd"/>
       <w:r>
         <w:rPr>
           <w:sz w:val="22"/>
           <w:szCs w:val="22"/>
         </w:rPr>
-        <w:t>, WT-referenced shift in total MM/GBSA interaction energy; ∆∆E</w:t>
+        <w:t>, WT-referenced shift in total MM/GBSA interaction energy; ∆∆</w:t>
+      </w:r>
+      <w:proofErr w:type="spellStart"/>
+      <w:r>
+        <w:rPr>
+          <w:sz w:val="22"/>
+          <w:szCs w:val="22"/>
+        </w:rPr>
+        <w:t>E</w:t>
       </w:r>
       <w:r>
         <w:rPr>
@@ -15130,12 +15525,21 @@
         </w:rPr>
         <w:t>vdW</w:t>
       </w:r>
+      <w:proofErr w:type="spellEnd"/>
       <w:r>
         <w:rPr>
           <w:sz w:val="22"/>
           <w:szCs w:val="22"/>
         </w:rPr>
-        <w:t>, van der Waals component; ∆∆E</w:t>
+        <w:t>, van der Waals component; ∆∆</w:t>
+      </w:r>
+      <w:proofErr w:type="spellStart"/>
+      <w:r>
+        <w:rPr>
+          <w:sz w:val="22"/>
+          <w:szCs w:val="22"/>
+        </w:rPr>
+        <w:t>E</w:t>
       </w:r>
       <w:r>
         <w:rPr>
@@ -15145,6 +15549,7 @@
         </w:rPr>
         <w:t>elec</w:t>
       </w:r>
+      <w:proofErr w:type="spellEnd"/>
       <w:r>
         <w:rPr>
           <w:sz w:val="22"/>
@@ -15180,7 +15585,15 @@
           <w:sz w:val="22"/>
           <w:szCs w:val="22"/>
         </w:rPr>
-        <w:t>, nonpolar surface area component; ∆∆G</w:t>
+        <w:t>, nonpolar surface area component; ∆∆</w:t>
+      </w:r>
+      <w:proofErr w:type="spellStart"/>
+      <w:r>
+        <w:rPr>
+          <w:sz w:val="22"/>
+          <w:szCs w:val="22"/>
+        </w:rPr>
+        <w:t>G</w:t>
       </w:r>
       <w:r>
         <w:rPr>
@@ -15190,6 +15603,7 @@
         </w:rPr>
         <w:t>bind</w:t>
       </w:r>
+      <w:proofErr w:type="spellEnd"/>
       <w:r>
         <w:rPr>
           <w:sz w:val="22"/>
@@ -15270,7 +15684,11 @@
         <w:t>Resistant</w:t>
       </w:r>
       <w:r>
-        <w:t xml:space="preserve"> mutations are predicted to have strong impact on RT-DOR interface energy, with V106I+F227C and K103N+M230L as the exceptions. Relative to WT, the three K103N-containing genotypes K103N (∆∆E</w:t>
+        <w:t xml:space="preserve"> mutations are predicted to have strong impact on RT-DOR interface energy, with V106I+F227C and K103N+M230L as the exceptions. Relative to WT, the three K103N-containing genotypes K103N (∆∆</w:t>
+      </w:r>
+      <w:proofErr w:type="spellStart"/>
+      <w:r>
+        <w:t>E</w:t>
       </w:r>
       <w:r>
         <w:rPr>
@@ -15278,8 +15696,13 @@
         </w:rPr>
         <w:t>Total</w:t>
       </w:r>
-      <w:r>
-        <w:t xml:space="preserve"> = -0.75 ± 0.13 kcal/mol), K103N+M230L (∆∆E</w:t>
+      <w:proofErr w:type="spellEnd"/>
+      <w:r>
+        <w:t xml:space="preserve"> = -0.75 ± 0.13 kcal/mol), K103N+M230L (∆∆</w:t>
+      </w:r>
+      <w:proofErr w:type="spellStart"/>
+      <w:r>
+        <w:t>E</w:t>
       </w:r>
       <w:r>
         <w:rPr>
@@ -15287,8 +15710,13 @@
         </w:rPr>
         <w:t>Total</w:t>
       </w:r>
-      <w:r>
-        <w:t xml:space="preserve"> = -1.42 ± 0.67 kcal/mol) and L100I+K103N (∆∆E</w:t>
+      <w:proofErr w:type="spellEnd"/>
+      <w:r>
+        <w:t xml:space="preserve"> = -1.42 ± 0.67 kcal/mol) and L100I+K103N (∆∆</w:t>
+      </w:r>
+      <w:proofErr w:type="spellStart"/>
+      <w:r>
+        <w:t>E</w:t>
       </w:r>
       <w:r>
         <w:rPr>
@@ -15296,6 +15724,7 @@
         </w:rPr>
         <w:t>Total</w:t>
       </w:r>
+      <w:proofErr w:type="spellEnd"/>
       <w:r>
         <w:t xml:space="preserve"> = -0.59 ± 1.01 kcal/mol) had net </w:t>
       </w:r>
@@ -15307,7 +15736,19 @@
         <w:t>negative</w:t>
       </w:r>
       <w:r>
-        <w:t xml:space="preserve"> interface energy, all three driven by electrostatic stabilization, ∆∆Eelec &lt; -1.8 kcal/mol. Along the same lines, amongst the Uncertain phenotype, L100I+K103N and K103N+P225H are predicted to have weak impact on RT-DOR interface energy, while the rest (V106M, G190S, and G190E) are predicted to have a strong impact. Out of the 13 genotypes with ∆∆E</w:t>
+        <w:t xml:space="preserve"> interface energy, all three driven by electrostatic stabilization, ∆∆</w:t>
+      </w:r>
+      <w:proofErr w:type="spellStart"/>
+      <w:r>
+        <w:t>Eelec</w:t>
+      </w:r>
+      <w:proofErr w:type="spellEnd"/>
+      <w:r>
+        <w:t xml:space="preserve"> &lt; -1.8 kcal/mol. Along the same lines, amongst the Uncertain phenotype, L100I+K103N and K103N+P225H are predicted to have weak impact on RT-DOR interface energy, while the rest (V106M, G190S, and G190E) are predicted to have a strong impact. Out of the 13 genotypes with ∆∆</w:t>
+      </w:r>
+      <w:proofErr w:type="spellStart"/>
+      <w:r>
+        <w:t>E</w:t>
       </w:r>
       <w:r>
         <w:rPr>
@@ -15315,8 +15756,13 @@
         </w:rPr>
         <w:t>Total</w:t>
       </w:r>
-      <w:r>
-        <w:t xml:space="preserve"> above the thermal energy threshold, 9 involve ∆∆E</w:t>
+      <w:proofErr w:type="spellEnd"/>
+      <w:r>
+        <w:t xml:space="preserve"> above the thermal energy threshold, 9 involve ∆∆</w:t>
+      </w:r>
+      <w:proofErr w:type="spellStart"/>
+      <w:r>
+        <w:t>E</w:t>
       </w:r>
       <w:r>
         <w:rPr>
@@ -15324,6 +15770,7 @@
         </w:rPr>
         <w:t>vdW</w:t>
       </w:r>
+      <w:proofErr w:type="spellEnd"/>
       <w:r>
         <w:t xml:space="preserve"> as the dominant contribution. In the remaining 4 genotypes, ∆∆E</w:t>
       </w:r>
@@ -15334,23 +15781,39 @@
         <w:t>GB</w:t>
       </w:r>
       <w:r>
-        <w:t xml:space="preserve"> has the major contribution in 3 of them, and ∆∆E</w:t>
+        <w:t xml:space="preserve"> has the major contribution in 3 of them, and ∆∆</w:t>
+      </w:r>
+      <w:proofErr w:type="spellStart"/>
+      <w:r>
+        <w:t>E</w:t>
       </w:r>
       <w:r>
         <w:rPr>
           <w:vertAlign w:val="subscript"/>
         </w:rPr>
-        <w:t xml:space="preserve">elec </w:t>
-      </w:r>
-      <w:r>
-        <w:t>has the dominant contribution in one. Notably, ∆∆E</w:t>
-      </w:r>
+        <w:t>elec</w:t>
+      </w:r>
+      <w:proofErr w:type="spellEnd"/>
       <w:r>
         <w:rPr>
           <w:vertAlign w:val="subscript"/>
         </w:rPr>
+        <w:t xml:space="preserve"> </w:t>
+      </w:r>
+      <w:r>
+        <w:t>has the dominant contribution in one. Notably, ∆∆</w:t>
+      </w:r>
+      <w:proofErr w:type="spellStart"/>
+      <w:r>
+        <w:t>E</w:t>
+      </w:r>
+      <w:r>
+        <w:rPr>
+          <w:vertAlign w:val="subscript"/>
+        </w:rPr>
         <w:t>elec</w:t>
       </w:r>
+      <w:proofErr w:type="spellEnd"/>
       <w:r>
         <w:t xml:space="preserve"> exhibits </w:t>
       </w:r>
@@ -15383,7 +15846,11 @@
         </w:rPr>
       </w:pPr>
       <w:r>
-        <w:t>While ∆∆G</w:t>
+        <w:t>While ∆∆</w:t>
+      </w:r>
+      <w:proofErr w:type="spellStart"/>
+      <w:r>
+        <w:t>G</w:t>
       </w:r>
       <w:r>
         <w:rPr>
@@ -15391,8 +15858,13 @@
         </w:rPr>
         <w:t>bind</w:t>
       </w:r>
-      <w:r>
-        <w:t xml:space="preserve"> and ∆∆E</w:t>
+      <w:proofErr w:type="spellEnd"/>
+      <w:r>
+        <w:t xml:space="preserve"> and ∆∆</w:t>
+      </w:r>
+      <w:proofErr w:type="spellStart"/>
+      <w:r>
+        <w:t>E</w:t>
       </w:r>
       <w:r>
         <w:rPr>
@@ -15400,6 +15872,7 @@
         </w:rPr>
         <w:t>Total</w:t>
       </w:r>
+      <w:proofErr w:type="spellEnd"/>
       <w:r>
         <w:t xml:space="preserve"> exhibit a weak correlation with each other (R</w:t>
       </w:r>
@@ -15410,7 +15883,11 @@
         <w:t xml:space="preserve">2 </w:t>
       </w:r>
       <w:r>
-        <w:t>= 0.18, p = 0.08), both of these metrics show practically no correlation with DOR fold-change values observed experimentally - ∆∆G</w:t>
+        <w:t>= 0.18, p = 0.08), both of these metrics show practically no correlation with DOR fold-change values observed experimentally - ∆∆</w:t>
+      </w:r>
+      <w:proofErr w:type="spellStart"/>
+      <w:r>
+        <w:t>G</w:t>
       </w:r>
       <w:r>
         <w:rPr>
@@ -15418,6 +15895,7 @@
         </w:rPr>
         <w:t>bind</w:t>
       </w:r>
+      <w:proofErr w:type="spellEnd"/>
       <w:r>
         <w:t xml:space="preserve"> vs log</w:t>
       </w:r>
@@ -15437,7 +15915,11 @@
         <w:t>2</w:t>
       </w:r>
       <w:r>
-        <w:t xml:space="preserve"> = 0.08, p = 0.26) and ∆∆E</w:t>
+        <w:t xml:space="preserve"> = 0.08, p = 0.26) and ∆∆</w:t>
+      </w:r>
+      <w:proofErr w:type="spellStart"/>
+      <w:r>
+        <w:t>E</w:t>
       </w:r>
       <w:r>
         <w:rPr>
@@ -15445,6 +15927,7 @@
         </w:rPr>
         <w:t>Total</w:t>
       </w:r>
+      <w:proofErr w:type="spellEnd"/>
       <w:r>
         <w:t xml:space="preserve"> vs log</w:t>
       </w:r>
@@ -15498,7 +15981,11 @@
         <w:t>Uncertain</w:t>
       </w:r>
       <w:r>
-        <w:t xml:space="preserve"> phenotype set), ∆∆G</w:t>
+        <w:t xml:space="preserve"> phenotype set), ∆∆</w:t>
+      </w:r>
+      <w:proofErr w:type="spellStart"/>
+      <w:r>
+        <w:t>G</w:t>
       </w:r>
       <w:r>
         <w:rPr>
@@ -15506,6 +15993,7 @@
         </w:rPr>
         <w:t>bind</w:t>
       </w:r>
+      <w:proofErr w:type="spellEnd"/>
       <w:r>
         <w:t xml:space="preserve"> exhibits weak correlation with log</w:t>
       </w:r>
@@ -15525,7 +16013,11 @@
         <w:t>2</w:t>
       </w:r>
       <w:r>
-        <w:t xml:space="preserve"> = 0.26, p = 0.07), while ∆∆E</w:t>
+        <w:t xml:space="preserve"> = 0.26, p = 0.07), while ∆∆</w:t>
+      </w:r>
+      <w:proofErr w:type="spellStart"/>
+      <w:r>
+        <w:t>E</w:t>
       </w:r>
       <w:r>
         <w:rPr>
@@ -15533,6 +16025,7 @@
         </w:rPr>
         <w:t>Total</w:t>
       </w:r>
+      <w:proofErr w:type="spellEnd"/>
       <w:r>
         <w:t xml:space="preserve"> correlation with log</w:t>
       </w:r>
@@ -15585,7 +16078,15 @@
         </w:rPr>
       </w:pPr>
       <w:r>
-        <w:t>To identify potential structural mechanisms underlying these energetic shifts, we measured a set of geometric observables in every equilibrium MD trajectory (see Table 3 and associated details in Supplementary Table 4). We find that the hydrogen bond between the residue 103 main-chain carbonyl oxygen and the DOR triazolinone nitrogen is conserved in most trajectories: 2.97 ± 0.01 Å in WT and lies between 2.80 and 3.22 Å in 16 of the 18 mutant genotypes, including all four genotypes carrying K103N (3.05–3.20 Å); the two exceptions are V106I (3.62 ± 0.30 Å) and V106M (3.56 ± 0.20 Å). Substituting Lys by Asn at position 103 shortens the side chain and brings its polar atoms closer to DOR, from 8.38 ± 0.15 Å in WT to 4.80–5.43 Å in every K103N-containing genotype. In contrast, this distance is 8.07–9.20 Å in every genotype that retains Lys103.</w:t>
+        <w:t xml:space="preserve">To identify potential structural mechanisms underlying these energetic shifts, we measured a set of geometric observables in every equilibrium MD trajectory (see Table 3 and associated details in Supplementary Table 4). We find that the hydrogen bond between the residue 103 main-chain carbonyl oxygen and the DOR triazolinone nitrogen is conserved in most trajectories: 2.97 ± 0.01 Å in WT and lies between 2.80 and 3.22 Å in 16 of the 18 mutant genotypes, including all four genotypes carrying K103N (3.05–3.20 Å); the two exceptions are V106I (3.62 ± 0.30 Å) and V106M (3.56 ± 0.20 Å). Substituting Lys by </w:t>
+      </w:r>
+      <w:proofErr w:type="spellStart"/>
+      <w:r>
+        <w:t>Asn</w:t>
+      </w:r>
+      <w:proofErr w:type="spellEnd"/>
+      <w:r>
+        <w:t xml:space="preserve"> at position 103 shortens the side chain and brings its polar atoms closer to DOR, from 8.38 ± 0.15 Å in WT to 4.80–5.43 Å in every K103N-containing genotype. In contrast, this distance is 8.07–9.20 Å in every genotype that retains Lys103.</w:t>
       </w:r>
     </w:p>
     <w:p>
@@ -15616,6 +16117,8 @@
           <w:szCs w:val="22"/>
         </w:rPr>
         <w:sectPr>
+          <w:footerReference w:type="even" r:id="rId17"/>
+          <w:footerReference w:type="default" r:id="rId18"/>
           <w:pgSz w:w="12240" w:h="15840"/>
           <w:pgMar w:top="1440" w:right="1440" w:bottom="1440" w:left="1440" w:header="0" w:footer="0" w:gutter="0"/>
           <w:cols w:space="720"/>
@@ -21053,7 +21556,15 @@
         <w:fldChar w:fldCharType="end"/>
       </w:r>
       <w:r>
-        <w:t xml:space="preserve"> Despite these observations, publicly available isolate-level susceptibility data for DOR remain sparse. As of September 2026, Stanford HIVDB indexes only 134 DOR-associated isolates tested by the PhenoSense assay, compared with 330 for RPV and 1,193 for ETR. This mismatch between growing clinical relevance and limited public phenotype data for DOR resistance motivated the present study. </w:t>
+        <w:t xml:space="preserve"> Despite these observations, publicly available isolate-level susceptibility data for DOR remain sparse. As of September 2026, Stanford HIVDB indexes only 134 DOR-associated isolates tested by the </w:t>
+      </w:r>
+      <w:proofErr w:type="spellStart"/>
+      <w:r>
+        <w:t>PhenoSense</w:t>
+      </w:r>
+      <w:proofErr w:type="spellEnd"/>
+      <w:r>
+        <w:t xml:space="preserve"> assay, compared with 330 for RPV and 1,193 for ETR. This mismatch between growing clinical relevance and limited public phenotype data for DOR resistance motivated the present study. </w:t>
       </w:r>
     </w:p>
     <w:p>
@@ -21409,7 +21920,11 @@
         </w:rPr>
       </w:pPr>
       <w:r>
-        <w:t>We found that the relative binding free energy, ∆∆G</w:t>
+        <w:t>We found that the relative binding free energy, ∆∆</w:t>
+      </w:r>
+      <w:proofErr w:type="spellStart"/>
+      <w:r>
+        <w:t>G</w:t>
       </w:r>
       <w:r>
         <w:rPr>
@@ -21417,6 +21932,7 @@
         </w:rPr>
         <w:t>bind</w:t>
       </w:r>
+      <w:proofErr w:type="spellEnd"/>
       <w:r>
         <w:t xml:space="preserve">, obtained from the FEP simulations correctly predicted low impact on RT-DOR binding affinity for 3 out of 4 </w:t>
       </w:r>
@@ -21804,7 +22320,11 @@
       </w:r>
       <w:r>
         <w:lastRenderedPageBreak/>
-        <w:t>why K103N+M230L and L100I+K103N also show insignificant binding penalties in our simulations (∆∆G</w:t>
+        <w:t>why K103N+M230L and L100I+K103N also show insignificant binding penalties in our simulations (∆∆</w:t>
+      </w:r>
+      <w:proofErr w:type="spellStart"/>
+      <w:r>
+        <w:t>G</w:t>
       </w:r>
       <w:r>
         <w:rPr>
@@ -21812,6 +22332,7 @@
         </w:rPr>
         <w:t>bind</w:t>
       </w:r>
+      <w:proofErr w:type="spellEnd"/>
       <w:r>
         <w:t xml:space="preserve"> = 0.59 ± 0.41 and 0.19 ± 0.68 kcal/mol).</w:t>
       </w:r>
@@ -21922,7 +22443,11 @@
         <w:fldChar w:fldCharType="end"/>
       </w:r>
       <w:r>
-        <w:t xml:space="preserve"> but in our trajectories losing Tyr181 does not lead to any direct impact on DOR binding, whereas losing Tyr188 removes about a third of the chlorocyanophenyl burial (Figure 3A) and carries both the largest van der Waals penalty (∆∆E</w:t>
+        <w:t xml:space="preserve"> but in our trajectories losing Tyr181 does not lead to any direct impact on DOR binding, whereas losing Tyr188 removes about a third of the chlorocyanophenyl burial (Figure 3A) and carries both the largest van der Waals penalty (∆∆</w:t>
+      </w:r>
+      <w:proofErr w:type="spellStart"/>
+      <w:r>
+        <w:t>E</w:t>
       </w:r>
       <w:r>
         <w:rPr>
@@ -21930,8 +22455,13 @@
         </w:rPr>
         <w:t>vdW</w:t>
       </w:r>
-      <w:r>
-        <w:t xml:space="preserve"> = 2.25 ± 0.20 kcal/mol) and one of the largest binding free energy penalties (∆∆G</w:t>
+      <w:proofErr w:type="spellEnd"/>
+      <w:r>
+        <w:t xml:space="preserve"> = 2.25 ± 0.20 kcal/mol) and one of the largest binding free energy penalties (∆∆</w:t>
+      </w:r>
+      <w:proofErr w:type="spellStart"/>
+      <w:r>
+        <w:t>G</w:t>
       </w:r>
       <w:r>
         <w:rPr>
@@ -21939,6 +22469,7 @@
         </w:rPr>
         <w:t>bind</w:t>
       </w:r>
+      <w:proofErr w:type="spellEnd"/>
       <w:r>
         <w:t xml:space="preserve"> = 4.52 ± 0.49 kcal/mol) in the entire panel. Aromatic packing of DOR is therefore hinges on Tyr188 alone, consistent with the crystallographic observation that the Tyr181 side chain is rotated away from the drug,</w:t>
       </w:r>
@@ -22129,7 +22660,11 @@
         <w:fldChar w:fldCharType="end"/>
       </w:r>
       <w:r>
-        <w:t xml:space="preserve"> but that region has room around the DOR pose, and all structural features calculated from our simulations suggest DOR packing in G190A RT is equivalent to that in WT (Table 3). On the other hand, G190S tilts the chlorocyanophenyl ring away from coplanarity with Tyr188. G190E is the most distorted system in the panel by two independent measures — Val179 displaced by nearly 3 Å and the pocket enlarged by ~25%. Yet the aromatic anchor is undisturbed and the drug remains fully buried, which is why a badly deformed pocket nonetheless binds DOR slightly more tightly than WT (∆∆G</w:t>
+        <w:t xml:space="preserve"> but that region has room around the DOR pose, and all structural features calculated from our simulations suggest DOR packing in G190A RT is equivalent to that in WT (Table 3). On the other hand, G190S tilts the chlorocyanophenyl ring away from coplanarity with Tyr188. G190E is the most distorted system in the panel by two independent measures — Val179 displaced by nearly 3 Å and the pocket enlarged by ~25%. Yet the aromatic anchor is undisturbed and the drug remains fully buried, which is why a badly deformed pocket nonetheless binds DOR slightly more tightly than WT (∆∆</w:t>
+      </w:r>
+      <w:proofErr w:type="spellStart"/>
+      <w:r>
+        <w:t>G</w:t>
       </w:r>
       <w:r>
         <w:rPr>
@@ -22137,6 +22672,7 @@
         </w:rPr>
         <w:t>bind</w:t>
       </w:r>
+      <w:proofErr w:type="spellEnd"/>
       <w:r>
         <w:t xml:space="preserve"> = −1.02 ± 0.38 kcal/mol). Notably, G190 substitutions increase susceptibility to DLV while severely impairing replication capacity, G190E most of all,</w:t>
       </w:r>
@@ -22266,7 +22802,11 @@
         <w:fldChar w:fldCharType="end"/>
       </w:r>
       <w:r>
-        <w:t xml:space="preserve"> — the two genotypes with the lowest pyridinone contact counts in our panel. In contrast, in V106I and V106M, DOR is pushed away from Ser105 and pressed against residue 106, the pyridinone contact count does not fall, and the cost appears instead at the other end of the molecule: these are the only two genotypes in which the residue 103 backbone anchor lengthens appreciably, by roughly 0.6 Å against a distance otherwise constant to within 0.25 Å across all 18 mutants (Table 3). V106I and V106M account for the two largest apparent overestimates of ∆∆G</w:t>
+        <w:t xml:space="preserve"> — the two genotypes with the lowest pyridinone contact counts in our panel. In contrast, in V106I and V106M, DOR is pushed away from Ser105 and pressed against residue 106, the pyridinone contact count does not fall, and the cost appears instead at the other end of the molecule: these are the only two genotypes in which the residue 103 backbone anchor lengthens appreciably, by roughly 0.6 Å against a distance otherwise constant to within 0.25 Å across all 18 mutants (Table 3). V106I and V106M account for the two largest apparent overestimates of ∆∆</w:t>
+      </w:r>
+      <w:proofErr w:type="spellStart"/>
+      <w:r>
+        <w:t>G</w:t>
       </w:r>
       <w:r>
         <w:rPr>
@@ -22274,6 +22814,7 @@
         </w:rPr>
         <w:t>bind</w:t>
       </w:r>
+      <w:proofErr w:type="spellEnd"/>
       <w:r>
         <w:t xml:space="preserve"> in the panel (+2.27 ± 0.74 and +6.10 ± 0.16 kcal/mol) against fold-changes of 1.1 and 3.4 (Table 1). Notably, however, in subtype C, V106M alone reduces DOR susceptibility 17-fold,</w:t>
       </w:r>
@@ -22344,7 +22885,11 @@
         <w:spacing w:after="240"/>
       </w:pPr>
       <w:r>
-        <w:t>Several genotypes show inconsistencies between ∆∆E</w:t>
+        <w:t>Several genotypes show inconsistencies between ∆∆</w:t>
+      </w:r>
+      <w:proofErr w:type="spellStart"/>
+      <w:r>
+        <w:t>E</w:t>
       </w:r>
       <w:r>
         <w:rPr>
@@ -22352,8 +22897,13 @@
         </w:rPr>
         <w:t>Total</w:t>
       </w:r>
-      <w:r>
-        <w:t xml:space="preserve"> and ∆∆G</w:t>
+      <w:proofErr w:type="spellEnd"/>
+      <w:r>
+        <w:t xml:space="preserve"> and ∆∆</w:t>
+      </w:r>
+      <w:proofErr w:type="spellStart"/>
+      <w:r>
+        <w:t>G</w:t>
       </w:r>
       <w:r>
         <w:rPr>
@@ -22361,6 +22911,7 @@
         </w:rPr>
         <w:t>bind</w:t>
       </w:r>
+      <w:proofErr w:type="spellEnd"/>
       <w:r>
         <w:t>, which is not surprising. The two measure different quantities, the interface energy of the bound complex versus the energetic difference between bound and unbound states.</w:t>
       </w:r>
@@ -22383,7 +22934,11 @@
         <w:fldChar w:fldCharType="end"/>
       </w:r>
       <w:r>
-        <w:t xml:space="preserve"> G190E and A98G+F227C both distort the DOR–RT interface (∆∆E</w:t>
+        <w:t xml:space="preserve"> G190E and A98G+F227C both distort the DOR–RT interface (∆∆</w:t>
+      </w:r>
+      <w:proofErr w:type="spellStart"/>
+      <w:r>
+        <w:t>E</w:t>
       </w:r>
       <w:r>
         <w:rPr>
@@ -22391,8 +22946,13 @@
         </w:rPr>
         <w:t>Total</w:t>
       </w:r>
-      <w:r>
-        <w:t xml:space="preserve"> = 1.94 ± 0.40 and 2.47 ± 0.24 kcal/mol), but comparable distortion is present in the apo simulations, so the penalty largely cancels in the thermodynamic cycle and the residual favors binding (∆∆G</w:t>
+      <w:proofErr w:type="spellEnd"/>
+      <w:r>
+        <w:t xml:space="preserve"> = 1.94 ± 0.40 and 2.47 ± 0.24 kcal/mol), but comparable distortion is present in the apo simulations, so the penalty largely cancels in the thermodynamic cycle and the residual favors binding (∆∆</w:t>
+      </w:r>
+      <w:proofErr w:type="spellStart"/>
+      <w:r>
+        <w:t>G</w:t>
       </w:r>
       <w:r>
         <w:rPr>
@@ -22400,8 +22960,13 @@
         </w:rPr>
         <w:t>bind</w:t>
       </w:r>
-      <w:r>
-        <w:t xml:space="preserve"> = −1.02 ± 0.38 and −1.53 ± 0.87 kcal/mol). Similarly, for K103N+M230L, our calculations suggest negligible binding penalty (∆∆G</w:t>
+      <w:proofErr w:type="spellEnd"/>
+      <w:r>
+        <w:t xml:space="preserve"> = −1.02 ± 0.38 and −1.53 ± 0.87 kcal/mol). Similarly, for K103N+M230L, our calculations suggest negligible binding penalty (∆∆</w:t>
+      </w:r>
+      <w:proofErr w:type="spellStart"/>
+      <w:r>
+        <w:t>G</w:t>
       </w:r>
       <w:r>
         <w:rPr>
@@ -22409,6 +22974,7 @@
         </w:rPr>
         <w:t>bind</w:t>
       </w:r>
+      <w:proofErr w:type="spellEnd"/>
       <w:r>
         <w:t xml:space="preserve"> = 0.59 ± 0.41 kcal/mol) despite a 36-fold reduction in susceptibility (Table 1). Structural metrics suggest DOR </w:t>
       </w:r>
@@ -22960,10 +23526,10 @@
         <w:t xml:space="preserve">Kaiming Tao — Division of Infectious Diseases, School of Medicine, Stanford University, Stanford, California 94305, United States; </w:t>
       </w:r>
       <w:r>
-        <w:rPr>
-          <w:highlight w:val="yellow"/>
-        </w:rPr>
-        <w:t>orcid.org/XXXX-XXXX-XXXX-XXXX</w:t>
+        <w:t>orcid.org/</w:t>
+      </w:r>
+      <w:r>
+        <w:t>0000-0001-8731-1271</w:t>
       </w:r>
     </w:p>
     <w:p>
@@ -22979,10 +23545,10 @@
         <w:t xml:space="preserve">Robert W. Shafer — Division of Infectious Diseases, School of Medicine, Stanford University, Stanford, California 94305, United States; </w:t>
       </w:r>
       <w:r>
-        <w:rPr>
-          <w:highlight w:val="yellow"/>
-        </w:rPr>
-        <w:t>orcid.org/XXXX-XXXX-XXXX-XXXX</w:t>
+        <w:t>orcid.org/</w:t>
+      </w:r>
+      <w:r>
+        <w:t>0000-0003-2513-2643</w:t>
       </w:r>
     </w:p>
     <w:p>
@@ -23045,13 +23611,10 @@
         <w:t xml:space="preserve">This work was supported by the </w:t>
       </w:r>
       <w:r>
-        <w:rPr>
-          <w:highlight w:val="yellow"/>
-        </w:rPr>
-        <w:t>National Institute of Allergy and Infectious Diseases, National Institutes of Health (grant number R24AI136618 to R.W.S.)</w:t>
-      </w:r>
-      <w:r>
-        <w:t>. The funders had no role in study design, data collection and analysis, decision to publish, or preparation of the manuscript.</w:t>
+        <w:t>National Institute of Allergy and Infectious Diseases, National Institutes of Health (grant number R24AI136618 to R.W.S.).</w:t>
+      </w:r>
+      <w:r>
+        <w:t xml:space="preserve"> The funders had no role in study design, data collection and analysis, decision to publish, or preparation of the manuscript.</w:t>
       </w:r>
     </w:p>
     <w:p>
@@ -28398,6 +28961,108 @@
     </w:sectPr>
   </w:body>
 </w:document>
+</file>
+
+<file path=word/footer1.xml><?xml version="1.0" encoding="utf-8"?>
+<w:ftr xmlns:wpc="http://schemas.microsoft.com/office/word/2010/wordprocessingCanvas" xmlns:mc="http://schemas.openxmlformats.org/markup-compatibility/2006" xmlns:o="urn:schemas-microsoft-com:office:office" xmlns:r="http://schemas.openxmlformats.org/officeDocument/2006/relationships" xmlns:m="http://schemas.openxmlformats.org/officeDocument/2006/math" xmlns:v="urn:schemas-microsoft-com:vml" xmlns:wp14="http://schemas.microsoft.com/office/word/2010/wordprocessingDrawing" xmlns:wp="http://schemas.openxmlformats.org/drawingml/2006/wordprocessingDrawing" xmlns:w10="urn:schemas-microsoft-com:office:word" xmlns:w="http://schemas.openxmlformats.org/wordprocessingml/2006/main" xmlns:w14="http://schemas.microsoft.com/office/word/2010/wordml" xmlns:wpg="http://schemas.microsoft.com/office/word/2010/wordprocessingGroup" xmlns:wpi="http://schemas.microsoft.com/office/word/2010/wordprocessingInk" xmlns:wne="http://schemas.microsoft.com/office/word/2006/wordml" xmlns:wps="http://schemas.microsoft.com/office/word/2010/wordprocessingShape" mc:Ignorable="w14 wp14">
+  <w:p>
+    <w:pPr>
+      <w:pStyle w:val="Footer"/>
+      <w:framePr w:wrap="around" w:vAnchor="text" w:hAnchor="margin" w:xAlign="right" w:y="1"/>
+      <w:rPr>
+        <w:rStyle w:val="PageNumber"/>
+      </w:rPr>
+    </w:pPr>
+    <w:r>
+      <w:rPr>
+        <w:rStyle w:val="PageNumber"/>
+      </w:rPr>
+      <w:fldChar w:fldCharType="begin"/>
+    </w:r>
+    <w:r>
+      <w:rPr>
+        <w:rStyle w:val="PageNumber"/>
+      </w:rPr>
+      <w:instrText xml:space="preserve">PAGE  </w:instrText>
+    </w:r>
+    <w:r>
+      <w:rPr>
+        <w:rStyle w:val="PageNumber"/>
+      </w:rPr>
+      <w:fldChar w:fldCharType="separate"/>
+    </w:r>
+    <w:r>
+      <w:rPr>
+        <w:rStyle w:val="PageNumber"/>
+        <w:noProof/>
+      </w:rPr>
+      <w:t>1</w:t>
+    </w:r>
+    <w:r>
+      <w:rPr>
+        <w:rStyle w:val="PageNumber"/>
+      </w:rPr>
+      <w:fldChar w:fldCharType="end"/>
+    </w:r>
+  </w:p>
+  <w:p>
+    <w:pPr>
+      <w:pStyle w:val="Footer"/>
+      <w:ind w:right="360"/>
+    </w:pPr>
+  </w:p>
+</w:ftr>
+</file>
+
+<file path=word/footer2.xml><?xml version="1.0" encoding="utf-8"?>
+<w:ftr xmlns:wpc="http://schemas.microsoft.com/office/word/2010/wordprocessingCanvas" xmlns:mc="http://schemas.openxmlformats.org/markup-compatibility/2006" xmlns:o="urn:schemas-microsoft-com:office:office" xmlns:r="http://schemas.openxmlformats.org/officeDocument/2006/relationships" xmlns:m="http://schemas.openxmlformats.org/officeDocument/2006/math" xmlns:v="urn:schemas-microsoft-com:vml" xmlns:wp14="http://schemas.microsoft.com/office/word/2010/wordprocessingDrawing" xmlns:wp="http://schemas.openxmlformats.org/drawingml/2006/wordprocessingDrawing" xmlns:w10="urn:schemas-microsoft-com:office:word" xmlns:w="http://schemas.openxmlformats.org/wordprocessingml/2006/main" xmlns:w14="http://schemas.microsoft.com/office/word/2010/wordml" xmlns:wpg="http://schemas.microsoft.com/office/word/2010/wordprocessingGroup" xmlns:wpi="http://schemas.microsoft.com/office/word/2010/wordprocessingInk" xmlns:wne="http://schemas.microsoft.com/office/word/2006/wordml" xmlns:wps="http://schemas.microsoft.com/office/word/2010/wordprocessingShape" mc:Ignorable="w14 wp14">
+  <w:p>
+    <w:pPr>
+      <w:pStyle w:val="Footer"/>
+      <w:framePr w:wrap="around" w:vAnchor="text" w:hAnchor="margin" w:xAlign="right" w:y="1"/>
+      <w:rPr>
+        <w:rStyle w:val="PageNumber"/>
+      </w:rPr>
+    </w:pPr>
+    <w:r>
+      <w:rPr>
+        <w:rStyle w:val="PageNumber"/>
+      </w:rPr>
+      <w:fldChar w:fldCharType="begin"/>
+    </w:r>
+    <w:r>
+      <w:rPr>
+        <w:rStyle w:val="PageNumber"/>
+      </w:rPr>
+      <w:instrText xml:space="preserve">PAGE  </w:instrText>
+    </w:r>
+    <w:r>
+      <w:rPr>
+        <w:rStyle w:val="PageNumber"/>
+      </w:rPr>
+      <w:fldChar w:fldCharType="separate"/>
+    </w:r>
+    <w:r>
+      <w:rPr>
+        <w:rStyle w:val="PageNumber"/>
+        <w:noProof/>
+      </w:rPr>
+      <w:t>1</w:t>
+    </w:r>
+    <w:r>
+      <w:rPr>
+        <w:rStyle w:val="PageNumber"/>
+      </w:rPr>
+      <w:fldChar w:fldCharType="end"/>
+    </w:r>
+  </w:p>
+  <w:p>
+    <w:pPr>
+      <w:pStyle w:val="Footer"/>
+      <w:ind w:right="360"/>
+    </w:pPr>
+  </w:p>
+</w:ftr>
 </file>
 
 <file path=word/numbering.xml><?xml version="1.0" encoding="utf-8"?>

</xml_diff>